<commit_message>
change sample file path & table inline hint
</commit_message>
<xml_diff>
--- a/docs/samples/word/MCB.BIM.TBL.PROVINCES.V1.2.docx
+++ b/docs/samples/word/MCB.BIM.TBL.PROVINCES.V1.2.docx
@@ -1857,7 +1857,7 @@
                 <w:sz w:val="18"/>
                 <w:szCs w:val="18"/>
               </w:rPr>
-              <w:t>BIM</w:t>
+              <w:t>DPS</w:t>
             </w:r>
           </w:p>
         </w:tc>
@@ -13647,7 +13647,9 @@
     <w:rsid w:val="00DC5172"/>
     <w:rsid w:val="00DD2F66"/>
     <w:rsid w:val="00DD325F"/>
+    <w:rsid w:val="00DD36FF"/>
     <w:rsid w:val="00DE0677"/>
+    <w:rsid w:val="00DF0A0F"/>
     <w:rsid w:val="00DF6A4B"/>
     <w:rsid w:val="00E73BAC"/>
     <w:rsid w:val="00E81B83"/>

</xml_diff>